<commit_message>
Update Time Series Modelling and Forecasting of Daily Oil Prices.docx
</commit_message>
<xml_diff>
--- a/Time Series Modelling and Forecasting of Daily Oil Prices.docx
+++ b/Time Series Modelling and Forecasting of Daily Oil Prices.docx
@@ -1600,7 +1600,7 @@
           <w:noProof/>
         </w:rPr>
         <w:drawing>
-          <wp:inline distT="0" distB="0" distL="0" distR="0" wp14:anchorId="3595E58D" wp14:editId="7012394D">
+          <wp:inline distT="0" distB="0" distL="0" distR="0" wp14:anchorId="3595E58D" wp14:editId="371C7742">
             <wp:extent cx="2640965" cy="932180"/>
             <wp:effectExtent l="0" t="0" r="635" b="0"/>
             <wp:docPr id="632148979" name="Picture 4"/>
@@ -1850,19 +1850,7 @@
             <w:lang w:eastAsia="en-GB"/>
             <w14:ligatures w14:val="none"/>
           </w:rPr>
-          <m:t>=0</m:t>
-        </m:r>
-        <m:r>
-          <m:rPr>
-            <m:sty m:val="p"/>
-          </m:rPr>
-          <w:rPr>
-            <w:rFonts w:ascii="Cambria Math" w:eastAsia="Times New Roman" w:hAnsi="Cambria Math" w:cs="Times New Roman"/>
-            <w:kern w:val="0"/>
-            <w:lang w:eastAsia="en-GB"/>
-            <w14:ligatures w14:val="none"/>
-          </w:rPr>
-          <m:t xml:space="preserve"> </m:t>
+          <m:t xml:space="preserve">=0 </m:t>
         </m:r>
       </m:oMath>
       <w:r>
@@ -1923,19 +1911,7 @@
             <w:lang w:eastAsia="en-GB"/>
             <w14:ligatures w14:val="none"/>
           </w:rPr>
-          <m:t>=0</m:t>
-        </m:r>
-        <m:r>
-          <m:rPr>
-            <m:sty m:val="p"/>
-          </m:rPr>
-          <w:rPr>
-            <w:rFonts w:ascii="Cambria Math" w:eastAsia="Times New Roman" w:hAnsi="Cambria Math" w:cs="Times New Roman"/>
-            <w:kern w:val="0"/>
-            <w:lang w:eastAsia="en-GB"/>
-            <w14:ligatures w14:val="none"/>
-          </w:rPr>
-          <m:t xml:space="preserve"> </m:t>
+          <m:t xml:space="preserve">=0 </m:t>
         </m:r>
       </m:oMath>
       <w:r>
@@ -1996,19 +1972,7 @@
             <w:lang w:eastAsia="en-GB"/>
             <w14:ligatures w14:val="none"/>
           </w:rPr>
-          <m:t>=0</m:t>
-        </m:r>
-        <m:r>
-          <m:rPr>
-            <m:sty m:val="p"/>
-          </m:rPr>
-          <w:rPr>
-            <w:rFonts w:ascii="Cambria Math" w:eastAsia="Times New Roman" w:hAnsi="Cambria Math" w:cs="Times New Roman"/>
-            <w:kern w:val="0"/>
-            <w:lang w:eastAsia="en-GB"/>
-            <w14:ligatures w14:val="none"/>
-          </w:rPr>
-          <m:t xml:space="preserve"> </m:t>
+          <m:t xml:space="preserve">=0 </m:t>
         </m:r>
       </m:oMath>
       <w:r>
@@ -3230,7 +3194,34 @@
           <w:lang w:eastAsia="en-GB"/>
           <w14:ligatures w14:val="none"/>
         </w:rPr>
-        <w:t>RMSE: 23.9591</w:t>
+        <w:t xml:space="preserve">RMSE: </w:t>
+      </w:r>
+      <w:r>
+        <w:rPr>
+          <w:rFonts w:ascii="Times New Roman" w:eastAsia="Times New Roman" w:hAnsi="Times New Roman" w:cs="Times New Roman"/>
+          <w:kern w:val="0"/>
+          <w:lang w:eastAsia="en-GB"/>
+          <w14:ligatures w14:val="none"/>
+        </w:rPr>
+        <w:t>10</w:t>
+      </w:r>
+      <w:r>
+        <w:rPr>
+          <w:rFonts w:ascii="Times New Roman" w:eastAsia="Times New Roman" w:hAnsi="Times New Roman" w:cs="Times New Roman"/>
+          <w:kern w:val="0"/>
+          <w:lang w:eastAsia="en-GB"/>
+          <w14:ligatures w14:val="none"/>
+        </w:rPr>
+        <w:t>.</w:t>
+      </w:r>
+      <w:r>
+        <w:rPr>
+          <w:rFonts w:ascii="Times New Roman" w:eastAsia="Times New Roman" w:hAnsi="Times New Roman" w:cs="Times New Roman"/>
+          <w:kern w:val="0"/>
+          <w:lang w:eastAsia="en-GB"/>
+          <w14:ligatures w14:val="none"/>
+        </w:rPr>
+        <w:t>16</w:t>
       </w:r>
     </w:p>
     <w:p>
@@ -3254,7 +3245,16 @@
           <w:lang w:eastAsia="en-GB"/>
           <w14:ligatures w14:val="none"/>
         </w:rPr>
-        <w:t>MAE: 19.0998</w:t>
+        <w:t xml:space="preserve">MAE: </w:t>
+      </w:r>
+      <w:r>
+        <w:rPr>
+          <w:rFonts w:ascii="Times New Roman" w:eastAsia="Times New Roman" w:hAnsi="Times New Roman" w:cs="Times New Roman"/>
+          <w:kern w:val="0"/>
+          <w:lang w:eastAsia="en-GB"/>
+          <w14:ligatures w14:val="none"/>
+        </w:rPr>
+        <w:t>08.28</w:t>
       </w:r>
     </w:p>
     <w:p>
@@ -3278,7 +3278,7 @@
           <w:lang w:eastAsia="en-GB"/>
           <w14:ligatures w14:val="none"/>
         </w:rPr>
-        <w:t>MAPE: 14.9358%</w:t>
+        <w:t>MAPE: 14.93%</w:t>
       </w:r>
     </w:p>
     <w:p>
@@ -4434,7 +4434,16 @@
           <w:lang w:eastAsia="en-GB"/>
           <w14:ligatures w14:val="none"/>
         </w:rPr>
-        <w:t>RMSE: 6.1480</w:t>
+        <w:t>RMSE: 6.</w:t>
+      </w:r>
+      <w:r>
+        <w:rPr>
+          <w:rFonts w:ascii="Times New Roman" w:eastAsia="Times New Roman" w:hAnsi="Times New Roman" w:cs="Times New Roman"/>
+          <w:kern w:val="0"/>
+          <w:lang w:eastAsia="en-GB"/>
+          <w14:ligatures w14:val="none"/>
+        </w:rPr>
+        <w:t>90</w:t>
       </w:r>
     </w:p>
     <w:p>
@@ -4458,7 +4467,16 @@
           <w:lang w:eastAsia="en-GB"/>
           <w14:ligatures w14:val="none"/>
         </w:rPr>
-        <w:t>MAE: 4.6246</w:t>
+        <w:t xml:space="preserve">MAE: </w:t>
+      </w:r>
+      <w:r>
+        <w:rPr>
+          <w:rFonts w:ascii="Times New Roman" w:eastAsia="Times New Roman" w:hAnsi="Times New Roman" w:cs="Times New Roman"/>
+          <w:kern w:val="0"/>
+          <w:lang w:eastAsia="en-GB"/>
+          <w14:ligatures w14:val="none"/>
+        </w:rPr>
+        <w:t>5.45</w:t>
       </w:r>
     </w:p>
     <w:p>
@@ -4482,7 +4500,25 @@
           <w:lang w:eastAsia="en-GB"/>
           <w14:ligatures w14:val="none"/>
         </w:rPr>
-        <w:t>MAPE: 3.3778%</w:t>
+        <w:t xml:space="preserve">MAPE: </w:t>
+      </w:r>
+      <w:r>
+        <w:rPr>
+          <w:rFonts w:ascii="Times New Roman" w:eastAsia="Times New Roman" w:hAnsi="Times New Roman" w:cs="Times New Roman"/>
+          <w:kern w:val="0"/>
+          <w:lang w:eastAsia="en-GB"/>
+          <w14:ligatures w14:val="none"/>
+        </w:rPr>
+        <w:t>4.03</w:t>
+      </w:r>
+      <w:r>
+        <w:rPr>
+          <w:rFonts w:ascii="Times New Roman" w:eastAsia="Times New Roman" w:hAnsi="Times New Roman" w:cs="Times New Roman"/>
+          <w:kern w:val="0"/>
+          <w:lang w:eastAsia="en-GB"/>
+          <w14:ligatures w14:val="none"/>
+        </w:rPr>
+        <w:t>%</w:t>
       </w:r>
     </w:p>
     <w:p>
@@ -4506,7 +4542,16 @@
           <w:lang w:eastAsia="en-GB"/>
           <w14:ligatures w14:val="none"/>
         </w:rPr>
-        <w:t>R²: 0.7968</w:t>
+        <w:t>R²: 0.7</w:t>
+      </w:r>
+      <w:r>
+        <w:rPr>
+          <w:rFonts w:ascii="Times New Roman" w:eastAsia="Times New Roman" w:hAnsi="Times New Roman" w:cs="Times New Roman"/>
+          <w:kern w:val="0"/>
+          <w:lang w:eastAsia="en-GB"/>
+          <w14:ligatures w14:val="none"/>
+        </w:rPr>
+        <w:t>4</w:t>
       </w:r>
     </w:p>
     <w:p>
@@ -4824,9 +4869,9 @@
       <w:tblGrid>
         <w:gridCol w:w="1017"/>
         <w:gridCol w:w="909"/>
-        <w:gridCol w:w="762"/>
-        <w:gridCol w:w="964"/>
-        <w:gridCol w:w="641"/>
+        <w:gridCol w:w="758"/>
+        <w:gridCol w:w="966"/>
+        <w:gridCol w:w="643"/>
       </w:tblGrid>
       <w:tr>
         <w:trPr>
@@ -5143,7 +5188,16 @@
                 <w:lang w:eastAsia="en-GB"/>
                 <w14:ligatures w14:val="none"/>
               </w:rPr>
-              <w:t>6.14</w:t>
+              <w:t>6.</w:t>
+            </w:r>
+            <w:r>
+              <w:rPr>
+                <w:rFonts w:ascii="Times New Roman" w:eastAsia="Times New Roman" w:hAnsi="Times New Roman" w:cs="Times New Roman"/>
+                <w:kern w:val="0"/>
+                <w:lang w:eastAsia="en-GB"/>
+                <w14:ligatures w14:val="none"/>
+              </w:rPr>
+              <w:t>90</w:t>
             </w:r>
           </w:p>
         </w:tc>
@@ -5168,7 +5222,7 @@
                 <w:lang w:eastAsia="en-GB"/>
                 <w14:ligatures w14:val="none"/>
               </w:rPr>
-              <w:t>4.62</w:t>
+              <w:t>5.45</w:t>
             </w:r>
           </w:p>
         </w:tc>
@@ -5193,7 +5247,16 @@
                 <w:lang w:eastAsia="en-GB"/>
                 <w14:ligatures w14:val="none"/>
               </w:rPr>
-              <w:t>3.37%</w:t>
+              <w:t>4.03</w:t>
+            </w:r>
+            <w:r>
+              <w:rPr>
+                <w:rFonts w:ascii="Times New Roman" w:eastAsia="Times New Roman" w:hAnsi="Times New Roman" w:cs="Times New Roman"/>
+                <w:kern w:val="0"/>
+                <w:lang w:eastAsia="en-GB"/>
+                <w14:ligatures w14:val="none"/>
+              </w:rPr>
+              <w:t>%</w:t>
             </w:r>
           </w:p>
         </w:tc>
@@ -5218,7 +5281,16 @@
                 <w:lang w:eastAsia="en-GB"/>
                 <w14:ligatures w14:val="none"/>
               </w:rPr>
-              <w:t>0.79</w:t>
+              <w:t>0.7</w:t>
+            </w:r>
+            <w:r>
+              <w:rPr>
+                <w:rFonts w:ascii="Times New Roman" w:eastAsia="Times New Roman" w:hAnsi="Times New Roman" w:cs="Times New Roman"/>
+                <w:kern w:val="0"/>
+                <w:lang w:eastAsia="en-GB"/>
+                <w14:ligatures w14:val="none"/>
+              </w:rPr>
+              <w:t>4</w:t>
             </w:r>
           </w:p>
         </w:tc>
@@ -5292,7 +5364,25 @@
                 <w:lang w:eastAsia="en-GB"/>
                 <w14:ligatures w14:val="none"/>
               </w:rPr>
-              <w:t>23.95</w:t>
+              <w:t>10</w:t>
+            </w:r>
+            <w:r>
+              <w:rPr>
+                <w:rFonts w:ascii="Times New Roman" w:eastAsia="Times New Roman" w:hAnsi="Times New Roman" w:cs="Times New Roman"/>
+                <w:kern w:val="0"/>
+                <w:lang w:eastAsia="en-GB"/>
+                <w14:ligatures w14:val="none"/>
+              </w:rPr>
+              <w:t>.</w:t>
+            </w:r>
+            <w:r>
+              <w:rPr>
+                <w:rFonts w:ascii="Times New Roman" w:eastAsia="Times New Roman" w:hAnsi="Times New Roman" w:cs="Times New Roman"/>
+                <w:kern w:val="0"/>
+                <w:lang w:eastAsia="en-GB"/>
+                <w14:ligatures w14:val="none"/>
+              </w:rPr>
+              <w:t>16</w:t>
             </w:r>
           </w:p>
         </w:tc>
@@ -5317,7 +5407,7 @@
                 <w:lang w:eastAsia="en-GB"/>
                 <w14:ligatures w14:val="none"/>
               </w:rPr>
-              <w:t>19.09</w:t>
+              <w:t>8.28</w:t>
             </w:r>
           </w:p>
         </w:tc>
@@ -5342,7 +5432,25 @@
                 <w:lang w:eastAsia="en-GB"/>
                 <w14:ligatures w14:val="none"/>
               </w:rPr>
-              <w:t>14.98%</w:t>
+              <w:t>14.9</w:t>
+            </w:r>
+            <w:r>
+              <w:rPr>
+                <w:rFonts w:ascii="Times New Roman" w:eastAsia="Times New Roman" w:hAnsi="Times New Roman" w:cs="Times New Roman"/>
+                <w:kern w:val="0"/>
+                <w:lang w:eastAsia="en-GB"/>
+                <w14:ligatures w14:val="none"/>
+              </w:rPr>
+              <w:t>3</w:t>
+            </w:r>
+            <w:r>
+              <w:rPr>
+                <w:rFonts w:ascii="Times New Roman" w:eastAsia="Times New Roman" w:hAnsi="Times New Roman" w:cs="Times New Roman"/>
+                <w:kern w:val="0"/>
+                <w:lang w:eastAsia="en-GB"/>
+                <w14:ligatures w14:val="none"/>
+              </w:rPr>
+              <w:t>%</w:t>
             </w:r>
           </w:p>
         </w:tc>
@@ -5367,7 +5475,7 @@
                 <w:lang w:eastAsia="en-GB"/>
                 <w14:ligatures w14:val="none"/>
               </w:rPr>
-              <w:t>—</w:t>
+              <w:t>__</w:t>
             </w:r>
           </w:p>
         </w:tc>
@@ -6449,19 +6557,8 @@
           <w:lang w:eastAsia="en-GB"/>
           <w14:ligatures w14:val="none"/>
         </w:rPr>
-        <w:t xml:space="preserve"> Machine Learning </w:t>
-      </w:r>
-      <w:proofErr w:type="spellStart"/>
-      <w:r>
-        <w:rPr>
-          <w:rFonts w:ascii="Times New Roman" w:eastAsia="Times New Roman" w:hAnsi="Times New Roman" w:cs="Times New Roman"/>
-          <w:kern w:val="0"/>
-          <w:lang w:eastAsia="en-GB"/>
-          <w14:ligatures w14:val="none"/>
-        </w:rPr>
-        <w:t>Models</w:t>
-      </w:r>
-      <w:proofErr w:type="spellEnd"/>
+        <w:t xml:space="preserve"> Machine Learning Models</w:t>
+      </w:r>
       <w:r>
         <w:rPr>
           <w:rFonts w:ascii="Times New Roman" w:eastAsia="Times New Roman" w:hAnsi="Times New Roman" w:cs="Times New Roman"/>

</xml_diff>